<commit_message>
Add role-aware Mexico Hub: judging, calendar, gallery, analytics, Entra gated off
</commit_message>
<xml_diff>
--- a/docs/Mexico-Hub-User-Guide.docx
+++ b/docs/Mexico-Hub-User-Guide.docx
@@ -2031,7 +2031,102 @@
           <w:color w:val="1F2A24"/>
           <w:sz w:val="22"/>
         </w:rPr>
-        <w:t>Microsoft sign-in and SharePoint list/file storage need Amdocs Entra admin consent. Until that is granted, use Google Drive uploads and Gmail / GitHub Issue submission paths. Details: sharepoint/lists-setup.md in the repository.</w:t>
+        <w:t>Microsoft sign-in and SharePoint list/file storage need Amdocs Entra admin consent. They are implemented in code but disabled by default (js/auth-config.js → entraEnabled: false). Flip to true after consent. Until then, use Google Drive uploads and Gmail / GitHub Issue submission paths. Details: sharepoint/lists-setup.md in the repository.</w:t>
+      </w:r>
+    </w:p>
+    <w:p>
+      <w:pPr>
+        <w:pStyle w:val="Heading2"/>
+      </w:pPr>
+      <w:r>
+        <w:rPr>
+          <w:rFonts w:ascii="Calibri" w:hAnsi="Calibri" w:eastAsia="Calibri"/>
+          <w:b/>
+          <w:i w:val="0"/>
+          <w:color w:val="CE1126"/>
+          <w:sz w:val="28"/>
+        </w:rPr>
+        <w:t>8.1 Roles, judging, and portal extras</w:t>
+      </w:r>
+    </w:p>
+    <w:p>
+      <w:pPr>
+        <w:pStyle w:val="ListBullet"/>
+        <w:spacing w:after="60"/>
+      </w:pPr>
+      <w:r>
+        <w:rPr>
+          <w:rFonts w:ascii="Calibri" w:hAnsi="Calibri" w:eastAsia="Calibri"/>
+          <w:b w:val="0"/>
+          <w:i w:val="0"/>
+          <w:color w:val="1F2A24"/>
+          <w:sz w:val="22"/>
+        </w:rPr>
+        <w:t>Roles are GitHub allowlists in auth-config.js (editors / organizers / judges).</w:t>
+      </w:r>
+    </w:p>
+    <w:p>
+      <w:pPr>
+        <w:pStyle w:val="ListBullet"/>
+        <w:spacing w:after="60"/>
+      </w:pPr>
+      <w:r>
+        <w:rPr>
+          <w:rFonts w:ascii="Calibri" w:hAnsi="Calibri" w:eastAsia="Calibri"/>
+          <w:b w:val="0"/>
+          <w:i w:val="0"/>
+          <w:color w:val="1F2A24"/>
+          <w:sz w:val="22"/>
+        </w:rPr>
+        <w:t>Judges score demo, deck, and code; organizers publish scoreboard and promote gallery winners.</w:t>
+      </w:r>
+    </w:p>
+    <w:p>
+      <w:pPr>
+        <w:pStyle w:val="ListBullet"/>
+        <w:spacing w:after="60"/>
+      </w:pPr>
+      <w:r>
+        <w:rPr>
+          <w:rFonts w:ascii="Calibri" w:hAnsi="Calibri" w:eastAsia="Calibri"/>
+          <w:b w:val="0"/>
+          <w:i w:val="0"/>
+          <w:color w:val="1F2A24"/>
+          <w:sz w:val="22"/>
+        </w:rPr>
+        <w:t>Organizers export judge CSV, post announcements, and view analytics.</w:t>
+      </w:r>
+    </w:p>
+    <w:p>
+      <w:pPr>
+        <w:pStyle w:val="ListBullet"/>
+        <w:spacing w:after="60"/>
+      </w:pPr>
+      <w:r>
+        <w:rPr>
+          <w:rFonts w:ascii="Calibri" w:hAnsi="Calibri" w:eastAsia="Calibri"/>
+          <w:b w:val="0"/>
+          <w:i w:val="0"/>
+          <w:color w:val="1F2A24"/>
+          <w:sz w:val="22"/>
+        </w:rPr>
+        <w:t>Calendar + ICS, deep links (#event/id), ES/EN, tour, capacity and deadlines are available broadly.</w:t>
+      </w:r>
+    </w:p>
+    <w:p>
+      <w:pPr>
+        <w:pStyle w:val="ListBullet"/>
+        <w:spacing w:after="60"/>
+      </w:pPr>
+      <w:r>
+        <w:rPr>
+          <w:rFonts w:ascii="Calibri" w:hAnsi="Calibri" w:eastAsia="Calibri"/>
+          <w:b w:val="0"/>
+          <w:i w:val="0"/>
+          <w:color w:val="1F2A24"/>
+          <w:sz w:val="22"/>
+        </w:rPr>
+        <w:t>Repo pull supports private GitHub (PAT popup) and multi-file picker.</w:t>
       </w:r>
     </w:p>
     <w:p>

</xml_diff>